<commit_message>
Added Component Diagram parts templates to be used for copying and pasting - and added further description in the style guide to match
</commit_message>
<xml_diff>
--- a/01_Standards/Milestone_1_Component_Diagram/Diagram_Style_Guide.docx
+++ b/01_Standards/Milestone_1_Component_Diagram/Diagram_Style_Guide.docx
@@ -1118,33 +1118,13 @@
         <w:rPr>
           <w:rFonts w:eastAsia="Times New Roman" w:cs="Times New Roman"/>
         </w:rPr>
-        <w:t xml:space="preserve">Port fill color </w:t>
-      </w:r>
-      <w:proofErr w:type="gramStart"/>
-      <w:r>
-        <w:rPr>
-          <w:rFonts w:eastAsia="Times New Roman" w:cs="Times New Roman"/>
-        </w:rPr>
-        <w:t>white (</w:t>
-      </w:r>
-      <w:r>
-        <w:rPr>
-          <w:rFonts w:eastAsia="Times New Roman" w:cs="Times New Roman"/>
-        </w:rPr>
-        <w:t>#</w:t>
-      </w:r>
-      <w:proofErr w:type="gramEnd"/>
-      <w:r>
-        <w:rPr>
-          <w:rFonts w:eastAsia="Times New Roman" w:cs="Times New Roman"/>
-        </w:rPr>
-        <w:t>FFFFFF</w:t>
-      </w:r>
-      <w:r>
-        <w:rPr>
-          <w:rFonts w:eastAsia="Times New Roman" w:cs="Times New Roman"/>
-        </w:rPr>
-        <w:t>)</w:t>
+        <w:t>B</w:t>
+      </w:r>
+      <w:r>
+        <w:rPr>
+          <w:rFonts w:eastAsia="Times New Roman" w:cs="Times New Roman"/>
+        </w:rPr>
+        <w:t xml:space="preserve">lack lines </w:t>
       </w:r>
     </w:p>
     <w:p>
@@ -1161,13 +1141,13 @@
         <w:rPr>
           <w:rFonts w:eastAsia="Times New Roman" w:cs="Times New Roman"/>
         </w:rPr>
-        <w:t>B</w:t>
-      </w:r>
-      <w:r>
-        <w:rPr>
-          <w:rFonts w:eastAsia="Times New Roman" w:cs="Times New Roman"/>
-        </w:rPr>
-        <w:t xml:space="preserve">lack lines </w:t>
+        <w:t>R</w:t>
+      </w:r>
+      <w:r>
+        <w:rPr>
+          <w:rFonts w:eastAsia="Times New Roman" w:cs="Times New Roman"/>
+        </w:rPr>
+        <w:t xml:space="preserve">ectangular component boxes </w:t>
       </w:r>
     </w:p>
     <w:p>
@@ -1184,13 +1164,45 @@
         <w:rPr>
           <w:rFonts w:eastAsia="Times New Roman" w:cs="Times New Roman"/>
         </w:rPr>
-        <w:t>R</w:t>
-      </w:r>
-      <w:r>
-        <w:rPr>
-          <w:rFonts w:eastAsia="Times New Roman" w:cs="Times New Roman"/>
-        </w:rPr>
-        <w:t xml:space="preserve">ectangular component boxes </w:t>
+        <w:t xml:space="preserve">Component pegs </w:t>
+      </w:r>
+      <w:r>
+        <w:rPr>
+          <w:rFonts w:eastAsia="Times New Roman" w:cs="Times New Roman"/>
+        </w:rPr>
+        <w:t xml:space="preserve">fill </w:t>
+      </w:r>
+      <w:r>
+        <w:rPr>
+          <w:rFonts w:eastAsia="Times New Roman" w:cs="Times New Roman"/>
+        </w:rPr>
+        <w:t xml:space="preserve">color </w:t>
+      </w:r>
+      <w:proofErr w:type="gramStart"/>
+      <w:r>
+        <w:rPr>
+          <w:rFonts w:eastAsia="Times New Roman" w:cs="Times New Roman"/>
+        </w:rPr>
+        <w:t>white (</w:t>
+      </w:r>
+      <w:r>
+        <w:rPr>
+          <w:rFonts w:eastAsia="Times New Roman" w:cs="Times New Roman"/>
+        </w:rPr>
+        <w:t>#</w:t>
+      </w:r>
+      <w:proofErr w:type="gramEnd"/>
+      <w:r>
+        <w:rPr>
+          <w:rFonts w:eastAsia="Times New Roman" w:cs="Times New Roman"/>
+        </w:rPr>
+        <w:t>FFFFFF</w:t>
+      </w:r>
+      <w:r>
+        <w:rPr>
+          <w:rFonts w:eastAsia="Times New Roman" w:cs="Times New Roman"/>
+        </w:rPr>
+        <w:t>)</w:t>
       </w:r>
     </w:p>
     <w:p>
@@ -1219,7 +1231,79 @@
         <w:rPr>
           <w:rFonts w:eastAsia="Times New Roman" w:cs="Times New Roman"/>
         </w:rPr>
-        <w:t xml:space="preserve"> - white fill for grey filled components and light grey filled for white filled components </w:t>
+        <w:t xml:space="preserve"> </w:t>
+      </w:r>
+      <w:r>
+        <w:rPr>
+          <w:rFonts w:eastAsia="Times New Roman" w:cs="Times New Roman"/>
+        </w:rPr>
+        <w:t>(</w:t>
+      </w:r>
+      <w:r>
+        <w:rPr>
+          <w:rFonts w:eastAsia="Times New Roman" w:cs="Times New Roman"/>
+        </w:rPr>
+        <w:t>#D9D9D9</w:t>
+      </w:r>
+      <w:r>
+        <w:rPr>
+          <w:rFonts w:eastAsia="Times New Roman" w:cs="Times New Roman"/>
+        </w:rPr>
+        <w:t xml:space="preserve"> &amp; </w:t>
+      </w:r>
+      <w:r>
+        <w:rPr>
+          <w:rFonts w:eastAsia="Times New Roman" w:cs="Times New Roman"/>
+        </w:rPr>
+        <w:t>#F2F2F2</w:t>
+      </w:r>
+      <w:r>
+        <w:rPr>
+          <w:rFonts w:eastAsia="Times New Roman" w:cs="Times New Roman"/>
+        </w:rPr>
+        <w:t>)</w:t>
+      </w:r>
+      <w:r>
+        <w:rPr>
+          <w:rFonts w:eastAsia="Times New Roman" w:cs="Times New Roman"/>
+        </w:rPr>
+        <w:t xml:space="preserve"> </w:t>
+      </w:r>
+      <w:r>
+        <w:rPr>
+          <w:rFonts w:eastAsia="Times New Roman" w:cs="Times New Roman"/>
+        </w:rPr>
+        <w:t>off-</w:t>
+      </w:r>
+      <w:r>
+        <w:rPr>
+          <w:rFonts w:eastAsia="Times New Roman" w:cs="Times New Roman"/>
+        </w:rPr>
+        <w:t xml:space="preserve">white fill for </w:t>
+      </w:r>
+      <w:r>
+        <w:rPr>
+          <w:rFonts w:eastAsia="Times New Roman" w:cs="Times New Roman"/>
+        </w:rPr>
+        <w:t xml:space="preserve">light </w:t>
+      </w:r>
+      <w:r>
+        <w:rPr>
+          <w:rFonts w:eastAsia="Times New Roman" w:cs="Times New Roman"/>
+        </w:rPr>
+        <w:t xml:space="preserve">grey filled components and light grey filled for </w:t>
+      </w:r>
+      <w:r>
+        <w:rPr>
+          <w:rFonts w:eastAsia="Times New Roman" w:cs="Times New Roman"/>
+        </w:rPr>
+        <w:t>off-</w:t>
+      </w:r>
+      <w:r>
+        <w:rPr>
+          <w:rFonts w:eastAsia="Times New Roman" w:cs="Times New Roman"/>
+        </w:rPr>
+        <w:t xml:space="preserve">white filled components </w:t>
       </w:r>
       <w:r>
         <w:rPr>
@@ -1280,35 +1364,81 @@
         </w:rPr>
         <w:t xml:space="preserve">- </w:t>
       </w:r>
-      <w:r>
-        <w:rPr>
-          <w:rFonts w:eastAsia="Times New Roman" w:cs="Times New Roman"/>
-        </w:rPr>
-        <w:t>lollipops</w:t>
-      </w:r>
-      <w:r>
-        <w:rPr>
-          <w:rFonts w:eastAsia="Times New Roman" w:cs="Times New Roman"/>
-        </w:rPr>
-        <w:t xml:space="preserve"> </w:t>
-      </w:r>
-      <w:r>
-        <w:rPr>
-          <w:rFonts w:eastAsia="Times New Roman" w:cs="Times New Roman"/>
-        </w:rPr>
-        <w:t>(Use copy from template</w:t>
-      </w:r>
-      <w:r>
-        <w:rPr>
-          <w:rFonts w:eastAsia="Times New Roman" w:cs="Times New Roman"/>
-        </w:rPr>
-        <w:t xml:space="preserve"> for consistent </w:t>
-      </w:r>
-      <w:r>
-        <w:rPr>
-          <w:rFonts w:eastAsia="Times New Roman" w:cs="Times New Roman"/>
-        </w:rPr>
-        <w:t>look)</w:t>
+      <w:proofErr w:type="gramStart"/>
+      <w:r>
+        <w:rPr>
+          <w:rFonts w:eastAsia="Times New Roman" w:cs="Times New Roman"/>
+        </w:rPr>
+        <w:t xml:space="preserve">lollipops </w:t>
+      </w:r>
+      <w:r>
+        <w:rPr>
+          <w:rFonts w:eastAsia="Times New Roman" w:cs="Times New Roman"/>
+        </w:rPr>
+        <w:t xml:space="preserve"> (</w:t>
+      </w:r>
+      <w:proofErr w:type="gramEnd"/>
+      <w:r>
+        <w:rPr>
+          <w:rFonts w:eastAsia="Times New Roman" w:cs="Times New Roman"/>
+        </w:rPr>
+        <w:t>#</w:t>
+      </w:r>
+      <w:proofErr w:type="gramStart"/>
+      <w:r>
+        <w:rPr>
+          <w:rFonts w:eastAsia="Times New Roman" w:cs="Times New Roman"/>
+        </w:rPr>
+        <w:t>D9D9D9</w:t>
+      </w:r>
+      <w:r>
+        <w:rPr>
+          <w:rFonts w:eastAsia="Times New Roman" w:cs="Times New Roman"/>
+        </w:rPr>
+        <w:t xml:space="preserve"> &amp; </w:t>
+      </w:r>
+      <w:r>
+        <w:rPr>
+          <w:rFonts w:eastAsia="Times New Roman" w:cs="Times New Roman"/>
+        </w:rPr>
+        <w:t>#</w:t>
+      </w:r>
+      <w:proofErr w:type="gramEnd"/>
+      <w:r>
+        <w:rPr>
+          <w:rFonts w:eastAsia="Times New Roman" w:cs="Times New Roman"/>
+        </w:rPr>
+        <w:t>D1D1D1</w:t>
+      </w:r>
+      <w:r>
+        <w:rPr>
+          <w:rFonts w:eastAsia="Times New Roman" w:cs="Times New Roman"/>
+        </w:rPr>
+        <w:t>)</w:t>
+      </w:r>
+      <w:r>
+        <w:rPr>
+          <w:rFonts w:eastAsia="Times New Roman" w:cs="Times New Roman"/>
+        </w:rPr>
+        <w:t xml:space="preserve"> fill </w:t>
+      </w:r>
+      <w:r>
+        <w:rPr>
+          <w:rFonts w:eastAsia="Times New Roman" w:cs="Times New Roman"/>
+        </w:rPr>
+        <w:t xml:space="preserve">color light grey for </w:t>
+      </w:r>
+      <w:r>
+        <w:rPr>
+          <w:rFonts w:eastAsia="Times New Roman" w:cs="Times New Roman"/>
+        </w:rPr>
+        <w:t xml:space="preserve">dark grey background and dark grey for light grey background </w:t>
+      </w:r>
+      <w:r>
+        <w:rPr>
+          <w:rFonts w:eastAsia="Times New Roman" w:cs="Times New Roman"/>
+        </w:rPr>
+        <w:t>(Use copy from template for consistent look)</w:t>
       </w:r>
     </w:p>
     <w:p>
@@ -1360,13 +1490,106 @@
         <w:rPr>
           <w:rFonts w:eastAsia="Times New Roman" w:cs="Times New Roman"/>
         </w:rPr>
-        <w:t xml:space="preserve">Port - square </w:t>
+        <w:t xml:space="preserve">Use </w:t>
+      </w:r>
+      <w:proofErr w:type="spellStart"/>
+      <w:r>
+        <w:rPr>
+          <w:rFonts w:eastAsia="Times New Roman" w:cs="Times New Roman"/>
+        </w:rPr>
+        <w:t>Assemby</w:t>
+      </w:r>
+      <w:proofErr w:type="spellEnd"/>
+      <w:r>
+        <w:rPr>
+          <w:rFonts w:eastAsia="Times New Roman" w:cs="Times New Roman"/>
+        </w:rPr>
+        <w:t xml:space="preserve"> Connector templates as a single unit of provided and required interfaces </w:t>
       </w:r>
       <w:r>
         <w:rPr>
           <w:rFonts w:eastAsia="Times New Roman" w:cs="Times New Roman"/>
         </w:rPr>
         <w:t>(Use copy from template for consistent look)</w:t>
+      </w:r>
+    </w:p>
+    <w:p>
+      <w:pPr>
+        <w:numPr>
+          <w:ilvl w:val="0"/>
+          <w:numId w:val="6"/>
+        </w:numPr>
+        <w:rPr>
+          <w:rFonts w:eastAsia="Times New Roman" w:cs="Times New Roman"/>
+        </w:rPr>
+      </w:pPr>
+      <w:r>
+        <w:rPr>
+          <w:rFonts w:eastAsia="Times New Roman" w:cs="Times New Roman"/>
+        </w:rPr>
+        <w:t xml:space="preserve">Port - </w:t>
+      </w:r>
+      <w:proofErr w:type="gramStart"/>
+      <w:r>
+        <w:rPr>
+          <w:rFonts w:eastAsia="Times New Roman" w:cs="Times New Roman"/>
+        </w:rPr>
+        <w:t xml:space="preserve">square </w:t>
+      </w:r>
+      <w:r>
+        <w:rPr>
+          <w:rFonts w:eastAsia="Times New Roman" w:cs="Times New Roman"/>
+        </w:rPr>
+        <w:t>(</w:t>
+      </w:r>
+      <w:r>
+        <w:rPr>
+          <w:rFonts w:eastAsia="Times New Roman" w:cs="Times New Roman"/>
+        </w:rPr>
+        <w:t>#</w:t>
+      </w:r>
+      <w:proofErr w:type="gramEnd"/>
+      <w:r>
+        <w:rPr>
+          <w:rFonts w:eastAsia="Times New Roman" w:cs="Times New Roman"/>
+        </w:rPr>
+        <w:t>FFFFFF</w:t>
+      </w:r>
+      <w:r>
+        <w:rPr>
+          <w:rFonts w:eastAsia="Times New Roman" w:cs="Times New Roman"/>
+        </w:rPr>
+        <w:t>)</w:t>
+      </w:r>
+      <w:r>
+        <w:rPr>
+          <w:rFonts w:eastAsia="Times New Roman" w:cs="Times New Roman"/>
+        </w:rPr>
+        <w:t xml:space="preserve"> fill </w:t>
+      </w:r>
+      <w:r>
+        <w:rPr>
+          <w:rFonts w:eastAsia="Times New Roman" w:cs="Times New Roman"/>
+        </w:rPr>
+        <w:t xml:space="preserve">color white </w:t>
+      </w:r>
+      <w:r>
+        <w:rPr>
+          <w:rFonts w:eastAsia="Times New Roman" w:cs="Times New Roman"/>
+        </w:rPr>
+        <w:t>(Use copy from template for consisten</w:t>
+      </w:r>
+      <w:r>
+        <w:rPr>
+          <w:rFonts w:eastAsia="Times New Roman" w:cs="Times New Roman"/>
+        </w:rPr>
+        <w:t>cy</w:t>
+      </w:r>
+      <w:r>
+        <w:rPr>
+          <w:rFonts w:eastAsia="Times New Roman" w:cs="Times New Roman"/>
+        </w:rPr>
+        <w:t>)</w:t>
       </w:r>
     </w:p>
     <w:p>
@@ -1869,6 +2092,7 @@
         <w:rPr>
           <w:rFonts w:eastAsia="Times New Roman" w:cs="Times New Roman"/>
         </w:rPr>
+        <w:lastRenderedPageBreak/>
         <w:t>Interfaces should be named by what service or data they expose.</w:t>
       </w:r>
     </w:p>
@@ -1951,7 +2175,6 @@
           <w:sz w:val="20"/>
           <w:szCs w:val="20"/>
         </w:rPr>
-        <w:lastRenderedPageBreak/>
         <w:t>Resume Data</w:t>
       </w:r>
       <w:r>
@@ -2793,6 +3016,7 @@
           <w:sz w:val="36"/>
           <w:szCs w:val="36"/>
         </w:rPr>
+        <w:lastRenderedPageBreak/>
         <w:t>9</w:t>
       </w:r>
       <w:r>
@@ -2867,7 +3091,6 @@
         <w:rPr>
           <w:rFonts w:eastAsia="Times New Roman" w:cs="Times New Roman"/>
         </w:rPr>
-        <w:lastRenderedPageBreak/>
         <w:t xml:space="preserve">external interfaces on the outside edge </w:t>
       </w:r>
     </w:p>

</xml_diff>

<commit_message>
Changed page background for the Style Guide to White.
</commit_message>
<xml_diff>
--- a/01_Standards/Milestone_1_Component_Diagram/Diagram_Style_Guide.docx
+++ b/01_Standards/Milestone_1_Component_Diagram/Diagram_Style_Guide.docx
@@ -1008,7 +1008,7 @@
         <w:rPr>
           <w:rFonts w:eastAsia="Times New Roman" w:cs="Times New Roman"/>
         </w:rPr>
-        <w:t>Dark grey</w:t>
+        <w:t>White</w:t>
       </w:r>
       <w:r>
         <w:rPr>
@@ -1016,7 +1016,12 @@
         </w:rPr>
         <w:t xml:space="preserve"> </w:t>
       </w:r>
-      <w:proofErr w:type="gramStart"/>
+      <w:r>
+        <w:rPr>
+          <w:rFonts w:eastAsia="Times New Roman" w:cs="Times New Roman"/>
+        </w:rPr>
+        <w:t xml:space="preserve">page </w:t>
+      </w:r>
       <w:r>
         <w:rPr>
           <w:rFonts w:eastAsia="Times New Roman" w:cs="Times New Roman"/>
@@ -1033,14 +1038,7 @@
         <w:rPr>
           <w:rFonts w:eastAsia="Times New Roman" w:cs="Times New Roman"/>
         </w:rPr>
-        <w:t>#</w:t>
-      </w:r>
-      <w:proofErr w:type="gramEnd"/>
-      <w:r>
-        <w:rPr>
-          <w:rFonts w:eastAsia="Times New Roman" w:cs="Times New Roman"/>
-        </w:rPr>
-        <w:t>D1D1D1</w:t>
+        <w:t>#FFFFFF</w:t>
       </w:r>
       <w:r>
         <w:rPr>
@@ -1414,13 +1412,7 @@
         <w:rPr>
           <w:rFonts w:eastAsia="Times New Roman" w:cs="Times New Roman"/>
         </w:rPr>
-        <w:t>)</w:t>
-      </w:r>
-      <w:r>
-        <w:rPr>
-          <w:rFonts w:eastAsia="Times New Roman" w:cs="Times New Roman"/>
-        </w:rPr>
-        <w:t xml:space="preserve"> fill </w:t>
+        <w:t xml:space="preserve">) fill </w:t>
       </w:r>
       <w:r>
         <w:rPr>
@@ -1504,13 +1496,7 @@
         <w:rPr>
           <w:rFonts w:eastAsia="Times New Roman" w:cs="Times New Roman"/>
         </w:rPr>
-        <w:t xml:space="preserve"> Connector templates as a single unit of provided and required interfaces </w:t>
-      </w:r>
-      <w:r>
-        <w:rPr>
-          <w:rFonts w:eastAsia="Times New Roman" w:cs="Times New Roman"/>
-        </w:rPr>
-        <w:t>(Use copy from template for consistent look)</w:t>
+        <w:t xml:space="preserve"> Connector templates as a single unit of provided and required interfaces (Use copy from template for consistent look)</w:t>
       </w:r>
     </w:p>
     <w:p>
@@ -1559,19 +1545,7 @@
         <w:rPr>
           <w:rFonts w:eastAsia="Times New Roman" w:cs="Times New Roman"/>
         </w:rPr>
-        <w:t>)</w:t>
-      </w:r>
-      <w:r>
-        <w:rPr>
-          <w:rFonts w:eastAsia="Times New Roman" w:cs="Times New Roman"/>
-        </w:rPr>
-        <w:t xml:space="preserve"> fill </w:t>
-      </w:r>
-      <w:r>
-        <w:rPr>
-          <w:rFonts w:eastAsia="Times New Roman" w:cs="Times New Roman"/>
-        </w:rPr>
-        <w:t xml:space="preserve">color white </w:t>
+        <w:t xml:space="preserve">) fill color white </w:t>
       </w:r>
       <w:r>
         <w:rPr>

</xml_diff>